<commit_message>
Prints de evidência e documentação final
</commit_message>
<xml_diff>
--- a/docs/Elos_ESG_Desafio_DevOps.docx
+++ b/docs/Elos_ESG_Desafio_DevOps.docx
@@ -151,11 +151,10 @@
       <w:r>
         <w:rPr>
           <w:rFonts w:ascii="Calibri" w:cs="Calibri" w:eastAsia="Calibri" w:hAnsi="Calibri"/>
-          <w:color w:val="6B7C74"/>
           <w:sz w:val="22"/>
           <w:szCs w:val="22"/>
         </w:rPr>
-        <w:t xml:space="preserve">https://github.com/&lt;seu-usuario&gt;/&lt;repositorio&gt;</w:t>
+        <w:t xml:space="preserve">https://github.com/heyblurryface/elos-esg-api</w:t>
       </w:r>
     </w:p>
     <w:p>
@@ -1232,7 +1231,7 @@
           <w:sz w:val="22"/>
           <w:szCs w:val="22"/>
         </w:rPr>
-        <w:t xml:space="preserve">Os dois ambientes rodam numa Virtual Machine Ubuntu 22.04 (Standard_B2ms, 2 vCPU e 8 GB) criada pelo script infra/azure-setup.sh no Azure Cloud Shell. O script instala o Docker via cloud-init, cria swap, libera no NSG as portas 8081 (staging) e 8080 (produção) e gera uma chave SSH exclusiva para o pipeline. O script infra/github-setup.sh configura as variables, os secrets e os environments do repositório pelo GitHub CLI.</w:t>
+        <w:t xml:space="preserve">Os dois ambientes rodam numa Virtual Machine Ubuntu 22.04 (Standard_B2s_v2, 2 vCPU e 8 GB) na região Chile Central, criada pelo script infra/azure-setup.sh no Azure Cloud Shell. O script instala o Docker via cloud-init, cria swap, libera no NSG as portas 8081 (staging) e 8080 (produção) e gera uma chave SSH exclusiva para o pipeline. O script infra/github-setup.sh configura as variables, os secrets e os environments do repositório pelo GitHub CLI.</w:t>
       </w:r>
     </w:p>
     <w:tbl>
@@ -1771,10 +1770,478 @@
       </w:tr>
     </w:tbl>
     <w:p>
-      <w:r>
-        <w:br w:type="page"/>
-      </w:r>
-    </w:p>
+      <w:pPr>
+        <w:spacing w:after="120"/>
+      </w:pPr>
+    </w:p>
+    <w:p>
+      <w:pPr>
+        <w:spacing w:after="120" w:line="300"/>
+      </w:pPr>
+      <w:r>
+        <w:rPr>
+          <w:rFonts w:ascii="Calibri" w:cs="Calibri" w:eastAsia="Calibri" w:hAnsi="Calibri"/>
+          <w:b/>
+          <w:bCs/>
+          <w:sz w:val="22"/>
+          <w:szCs w:val="22"/>
+        </w:rPr>
+        <w:t xml:space="preserve">Endereços: </w:t>
+      </w:r>
+      <w:r>
+        <w:rPr>
+          <w:rFonts w:ascii="Calibri" w:cs="Calibri" w:eastAsia="Calibri" w:hAnsi="Calibri"/>
+          <w:sz w:val="22"/>
+          <w:szCs w:val="22"/>
+        </w:rPr>
+        <w:t xml:space="preserve">staging em http://68.211.144.197:8081/swagger e produção em http://68.211.144.197:8080/swagger (disponíveis enquanto a VM estiver ligada).</w:t>
+      </w:r>
+    </w:p>
+    <w:tbl>
+      <w:tblPr>
+        <w:tblW w:type="dxa" w:w="9638"/>
+        <w:tblBorders>
+          <w:top w:val="single" w:color="auto" w:sz="4"/>
+          <w:left w:val="single" w:color="auto" w:sz="4"/>
+          <w:bottom w:val="single" w:color="auto" w:sz="4"/>
+          <w:right w:val="single" w:color="auto" w:sz="4"/>
+          <w:insideH w:val="single" w:color="auto" w:sz="4"/>
+          <w:insideV w:val="single" w:color="auto" w:sz="4"/>
+        </w:tblBorders>
+      </w:tblPr>
+      <w:tblGrid>
+        <w:gridCol w:w="2600"/>
+        <w:gridCol w:w="7038"/>
+      </w:tblGrid>
+      <w:tr>
+        <w:trPr>
+          <w:tblHeader/>
+        </w:trPr>
+        <w:tc>
+          <w:tcPr>
+            <w:tcW w:type="dxa" w:w="2600"/>
+            <w:tcBorders>
+              <w:top w:val="single" w:color="BFC9C4" w:sz="4"/>
+              <w:left w:val="single" w:color="BFC9C4" w:sz="4"/>
+              <w:bottom w:val="single" w:color="BFC9C4" w:sz="4"/>
+              <w:right w:val="single" w:color="BFC9C4" w:sz="4"/>
+            </w:tcBorders>
+            <w:shd w:fill="1F6F50" w:color="auto" w:val="clear"/>
+            <w:tcMar>
+              <w:top w:type="dxa" w:w="80"/>
+              <w:left w:type="dxa" w:w="110"/>
+              <w:bottom w:type="dxa" w:w="80"/>
+              <w:right w:type="dxa" w:w="110"/>
+            </w:tcMar>
+          </w:tcPr>
+          <w:p>
+            <w:pPr>
+              <w:spacing w:after="0" w:line="270"/>
+            </w:pPr>
+            <w:r>
+              <w:rPr>
+                <w:rFonts w:ascii="Calibri" w:cs="Calibri" w:eastAsia="Calibri" w:hAnsi="Calibri"/>
+                <w:b/>
+                <w:bCs/>
+                <w:color w:val="FFFFFF"/>
+                <w:sz w:val="20"/>
+                <w:szCs w:val="20"/>
+              </w:rPr>
+              <w:t xml:space="preserve">Execução validada</w:t>
+            </w:r>
+          </w:p>
+        </w:tc>
+        <w:tc>
+          <w:tcPr>
+            <w:tcW w:type="dxa" w:w="7038"/>
+            <w:tcBorders>
+              <w:top w:val="single" w:color="BFC9C4" w:sz="4"/>
+              <w:left w:val="single" w:color="BFC9C4" w:sz="4"/>
+              <w:bottom w:val="single" w:color="BFC9C4" w:sz="4"/>
+              <w:right w:val="single" w:color="BFC9C4" w:sz="4"/>
+            </w:tcBorders>
+            <w:shd w:fill="1F6F50" w:color="auto" w:val="clear"/>
+            <w:tcMar>
+              <w:top w:type="dxa" w:w="80"/>
+              <w:left w:type="dxa" w:w="110"/>
+              <w:bottom w:type="dxa" w:w="80"/>
+              <w:right w:type="dxa" w:w="110"/>
+            </w:tcMar>
+          </w:tcPr>
+          <w:p>
+            <w:pPr>
+              <w:spacing w:after="0" w:line="270"/>
+            </w:pPr>
+            <w:r>
+              <w:rPr>
+                <w:rFonts w:ascii="Calibri" w:cs="Calibri" w:eastAsia="Calibri" w:hAnsi="Calibri"/>
+                <w:b/>
+                <w:bCs/>
+                <w:color w:val="FFFFFF"/>
+                <w:sz w:val="20"/>
+                <w:szCs w:val="20"/>
+              </w:rPr>
+              <w:t xml:space="preserve">Resultado</w:t>
+            </w:r>
+          </w:p>
+        </w:tc>
+      </w:tr>
+      <w:tr>
+        <w:trPr>
+          <w:tblHeader w:val="false"/>
+        </w:trPr>
+        <w:tc>
+          <w:tcPr>
+            <w:tcW w:type="dxa" w:w="2600"/>
+            <w:tcBorders>
+              <w:top w:val="single" w:color="BFC9C4" w:sz="4"/>
+              <w:left w:val="single" w:color="BFC9C4" w:sz="4"/>
+              <w:bottom w:val="single" w:color="BFC9C4" w:sz="4"/>
+              <w:right w:val="single" w:color="BFC9C4" w:sz="4"/>
+            </w:tcBorders>
+            <w:tcMar>
+              <w:top w:type="dxa" w:w="80"/>
+              <w:left w:type="dxa" w:w="110"/>
+              <w:bottom w:type="dxa" w:w="80"/>
+              <w:right w:type="dxa" w:w="110"/>
+            </w:tcMar>
+          </w:tcPr>
+          <w:p>
+            <w:pPr>
+              <w:spacing w:after="0" w:line="270"/>
+            </w:pPr>
+            <w:r>
+              <w:rPr>
+                <w:rFonts w:ascii="Calibri" w:cs="Calibri" w:eastAsia="Calibri" w:hAnsi="Calibri"/>
+                <w:b w:val="false"/>
+                <w:bCs w:val="false"/>
+                <w:color w:val="222222"/>
+                <w:sz w:val="20"/>
+                <w:szCs w:val="20"/>
+              </w:rPr>
+              <w:t xml:space="preserve">Execução</w:t>
+            </w:r>
+          </w:p>
+        </w:tc>
+        <w:tc>
+          <w:tcPr>
+            <w:tcW w:type="dxa" w:w="7038"/>
+            <w:tcBorders>
+              <w:top w:val="single" w:color="BFC9C4" w:sz="4"/>
+              <w:left w:val="single" w:color="BFC9C4" w:sz="4"/>
+              <w:bottom w:val="single" w:color="BFC9C4" w:sz="4"/>
+              <w:right w:val="single" w:color="BFC9C4" w:sz="4"/>
+            </w:tcBorders>
+            <w:tcMar>
+              <w:top w:type="dxa" w:w="80"/>
+              <w:left w:type="dxa" w:w="110"/>
+              <w:bottom w:type="dxa" w:w="80"/>
+              <w:right w:type="dxa" w:w="110"/>
+            </w:tcMar>
+          </w:tcPr>
+          <w:p>
+            <w:pPr>
+              <w:spacing w:after="0" w:line="270"/>
+            </w:pPr>
+            <w:r>
+              <w:rPr>
+                <w:rFonts w:ascii="Calibri" w:cs="Calibri" w:eastAsia="Calibri" w:hAnsi="Calibri"/>
+                <w:b w:val="false"/>
+                <w:bCs w:val="false"/>
+                <w:color w:val="222222"/>
+                <w:sz w:val="20"/>
+                <w:szCs w:val="20"/>
+              </w:rPr>
+              <w:t xml:space="preserve">CI/CD - Elos ESG API #2, commit 2b0edc4</w:t>
+            </w:r>
+          </w:p>
+        </w:tc>
+      </w:tr>
+      <w:tr>
+        <w:trPr>
+          <w:tblHeader w:val="false"/>
+        </w:trPr>
+        <w:tc>
+          <w:tcPr>
+            <w:tcW w:type="dxa" w:w="2600"/>
+            <w:tcBorders>
+              <w:top w:val="single" w:color="BFC9C4" w:sz="4"/>
+              <w:left w:val="single" w:color="BFC9C4" w:sz="4"/>
+              <w:bottom w:val="single" w:color="BFC9C4" w:sz="4"/>
+              <w:right w:val="single" w:color="BFC9C4" w:sz="4"/>
+            </w:tcBorders>
+            <w:tcMar>
+              <w:top w:type="dxa" w:w="80"/>
+              <w:left w:type="dxa" w:w="110"/>
+              <w:bottom w:type="dxa" w:w="80"/>
+              <w:right w:type="dxa" w:w="110"/>
+            </w:tcMar>
+          </w:tcPr>
+          <w:p>
+            <w:pPr>
+              <w:spacing w:after="0" w:line="270"/>
+            </w:pPr>
+            <w:r>
+              <w:rPr>
+                <w:rFonts w:ascii="Calibri" w:cs="Calibri" w:eastAsia="Calibri" w:hAnsi="Calibri"/>
+                <w:b w:val="false"/>
+                <w:bCs w:val="false"/>
+                <w:color w:val="222222"/>
+                <w:sz w:val="20"/>
+                <w:szCs w:val="20"/>
+              </w:rPr>
+              <w:t xml:space="preserve">Build e testes</w:t>
+            </w:r>
+          </w:p>
+        </w:tc>
+        <w:tc>
+          <w:tcPr>
+            <w:tcW w:type="dxa" w:w="7038"/>
+            <w:tcBorders>
+              <w:top w:val="single" w:color="BFC9C4" w:sz="4"/>
+              <w:left w:val="single" w:color="BFC9C4" w:sz="4"/>
+              <w:bottom w:val="single" w:color="BFC9C4" w:sz="4"/>
+              <w:right w:val="single" w:color="BFC9C4" w:sz="4"/>
+            </w:tcBorders>
+            <w:tcMar>
+              <w:top w:type="dxa" w:w="80"/>
+              <w:left w:type="dxa" w:w="110"/>
+              <w:bottom w:type="dxa" w:w="80"/>
+              <w:right w:type="dxa" w:w="110"/>
+            </w:tcMar>
+          </w:tcPr>
+          <w:p>
+            <w:pPr>
+              <w:spacing w:after="0" w:line="270"/>
+            </w:pPr>
+            <w:r>
+              <w:rPr>
+                <w:rFonts w:ascii="Calibri" w:cs="Calibri" w:eastAsia="Calibri" w:hAnsi="Calibri"/>
+                <w:b w:val="false"/>
+                <w:bCs w:val="false"/>
+                <w:color w:val="222222"/>
+                <w:sz w:val="20"/>
+                <w:szCs w:val="20"/>
+              </w:rPr>
+              <w:t xml:space="preserve">26 testes executados, 26 aprovados (39s)</w:t>
+            </w:r>
+          </w:p>
+        </w:tc>
+      </w:tr>
+      <w:tr>
+        <w:trPr>
+          <w:tblHeader w:val="false"/>
+        </w:trPr>
+        <w:tc>
+          <w:tcPr>
+            <w:tcW w:type="dxa" w:w="2600"/>
+            <w:tcBorders>
+              <w:top w:val="single" w:color="BFC9C4" w:sz="4"/>
+              <w:left w:val="single" w:color="BFC9C4" w:sz="4"/>
+              <w:bottom w:val="single" w:color="BFC9C4" w:sz="4"/>
+              <w:right w:val="single" w:color="BFC9C4" w:sz="4"/>
+            </w:tcBorders>
+            <w:tcMar>
+              <w:top w:type="dxa" w:w="80"/>
+              <w:left w:type="dxa" w:w="110"/>
+              <w:bottom w:type="dxa" w:w="80"/>
+              <w:right w:type="dxa" w:w="110"/>
+            </w:tcMar>
+          </w:tcPr>
+          <w:p>
+            <w:pPr>
+              <w:spacing w:after="0" w:line="270"/>
+            </w:pPr>
+            <w:r>
+              <w:rPr>
+                <w:rFonts w:ascii="Calibri" w:cs="Calibri" w:eastAsia="Calibri" w:hAnsi="Calibri"/>
+                <w:b w:val="false"/>
+                <w:bCs w:val="false"/>
+                <w:color w:val="222222"/>
+                <w:sz w:val="20"/>
+                <w:szCs w:val="20"/>
+              </w:rPr>
+              <w:t xml:space="preserve">Imagem</w:t>
+            </w:r>
+          </w:p>
+        </w:tc>
+        <w:tc>
+          <w:tcPr>
+            <w:tcW w:type="dxa" w:w="7038"/>
+            <w:tcBorders>
+              <w:top w:val="single" w:color="BFC9C4" w:sz="4"/>
+              <w:left w:val="single" w:color="BFC9C4" w:sz="4"/>
+              <w:bottom w:val="single" w:color="BFC9C4" w:sz="4"/>
+              <w:right w:val="single" w:color="BFC9C4" w:sz="4"/>
+            </w:tcBorders>
+            <w:tcMar>
+              <w:top w:type="dxa" w:w="80"/>
+              <w:left w:type="dxa" w:w="110"/>
+              <w:bottom w:type="dxa" w:w="80"/>
+              <w:right w:type="dxa" w:w="110"/>
+            </w:tcMar>
+          </w:tcPr>
+          <w:p>
+            <w:pPr>
+              <w:spacing w:after="0" w:line="270"/>
+            </w:pPr>
+            <w:r>
+              <w:rPr>
+                <w:rFonts w:ascii="Calibri" w:cs="Calibri" w:eastAsia="Calibri" w:hAnsi="Calibri"/>
+                <w:b w:val="false"/>
+                <w:bCs w:val="false"/>
+                <w:color w:val="222222"/>
+                <w:sz w:val="20"/>
+                <w:szCs w:val="20"/>
+              </w:rPr>
+              <w:t xml:space="preserve">ghcr.io/heyblurryface/elos-esg-api:sha-2b0edc4 (47s)</w:t>
+            </w:r>
+          </w:p>
+        </w:tc>
+      </w:tr>
+      <w:tr>
+        <w:trPr>
+          <w:tblHeader w:val="false"/>
+        </w:trPr>
+        <w:tc>
+          <w:tcPr>
+            <w:tcW w:type="dxa" w:w="2600"/>
+            <w:tcBorders>
+              <w:top w:val="single" w:color="BFC9C4" w:sz="4"/>
+              <w:left w:val="single" w:color="BFC9C4" w:sz="4"/>
+              <w:bottom w:val="single" w:color="BFC9C4" w:sz="4"/>
+              <w:right w:val="single" w:color="BFC9C4" w:sz="4"/>
+            </w:tcBorders>
+            <w:tcMar>
+              <w:top w:type="dxa" w:w="80"/>
+              <w:left w:type="dxa" w:w="110"/>
+              <w:bottom w:type="dxa" w:w="80"/>
+              <w:right w:type="dxa" w:w="110"/>
+            </w:tcMar>
+          </w:tcPr>
+          <w:p>
+            <w:pPr>
+              <w:spacing w:after="0" w:line="270"/>
+            </w:pPr>
+            <w:r>
+              <w:rPr>
+                <w:rFonts w:ascii="Calibri" w:cs="Calibri" w:eastAsia="Calibri" w:hAnsi="Calibri"/>
+                <w:b w:val="false"/>
+                <w:bCs w:val="false"/>
+                <w:color w:val="222222"/>
+                <w:sz w:val="20"/>
+                <w:szCs w:val="20"/>
+              </w:rPr>
+              <w:t xml:space="preserve">Deploy staging</w:t>
+            </w:r>
+          </w:p>
+        </w:tc>
+        <w:tc>
+          <w:tcPr>
+            <w:tcW w:type="dxa" w:w="7038"/>
+            <w:tcBorders>
+              <w:top w:val="single" w:color="BFC9C4" w:sz="4"/>
+              <w:left w:val="single" w:color="BFC9C4" w:sz="4"/>
+              <w:bottom w:val="single" w:color="BFC9C4" w:sz="4"/>
+              <w:right w:val="single" w:color="BFC9C4" w:sz="4"/>
+            </w:tcBorders>
+            <w:tcMar>
+              <w:top w:type="dxa" w:w="80"/>
+              <w:left w:type="dxa" w:w="110"/>
+              <w:bottom w:type="dxa" w:w="80"/>
+              <w:right w:type="dxa" w:w="110"/>
+            </w:tcMar>
+          </w:tcPr>
+          <w:p>
+            <w:pPr>
+              <w:spacing w:after="0" w:line="270"/>
+            </w:pPr>
+            <w:r>
+              <w:rPr>
+                <w:rFonts w:ascii="Calibri" w:cs="Calibri" w:eastAsia="Calibri" w:hAnsi="Calibri"/>
+                <w:b w:val="false"/>
+                <w:bCs w:val="false"/>
+                <w:color w:val="222222"/>
+                <w:sz w:val="20"/>
+                <w:szCs w:val="20"/>
+              </w:rPr>
+              <w:t xml:space="preserve">Sucesso em 1m43s, smoke test OK</w:t>
+            </w:r>
+          </w:p>
+        </w:tc>
+      </w:tr>
+      <w:tr>
+        <w:trPr>
+          <w:tblHeader w:val="false"/>
+        </w:trPr>
+        <w:tc>
+          <w:tcPr>
+            <w:tcW w:type="dxa" w:w="2600"/>
+            <w:tcBorders>
+              <w:top w:val="single" w:color="BFC9C4" w:sz="4"/>
+              <w:left w:val="single" w:color="BFC9C4" w:sz="4"/>
+              <w:bottom w:val="single" w:color="BFC9C4" w:sz="4"/>
+              <w:right w:val="single" w:color="BFC9C4" w:sz="4"/>
+            </w:tcBorders>
+            <w:tcMar>
+              <w:top w:type="dxa" w:w="80"/>
+              <w:left w:type="dxa" w:w="110"/>
+              <w:bottom w:type="dxa" w:w="80"/>
+              <w:right w:type="dxa" w:w="110"/>
+            </w:tcMar>
+          </w:tcPr>
+          <w:p>
+            <w:pPr>
+              <w:spacing w:after="0" w:line="270"/>
+            </w:pPr>
+            <w:r>
+              <w:rPr>
+                <w:rFonts w:ascii="Calibri" w:cs="Calibri" w:eastAsia="Calibri" w:hAnsi="Calibri"/>
+                <w:b w:val="false"/>
+                <w:bCs w:val="false"/>
+                <w:color w:val="222222"/>
+                <w:sz w:val="20"/>
+                <w:szCs w:val="20"/>
+              </w:rPr>
+              <w:t xml:space="preserve">Deploy produção</w:t>
+            </w:r>
+          </w:p>
+        </w:tc>
+        <w:tc>
+          <w:tcPr>
+            <w:tcW w:type="dxa" w:w="7038"/>
+            <w:tcBorders>
+              <w:top w:val="single" w:color="BFC9C4" w:sz="4"/>
+              <w:left w:val="single" w:color="BFC9C4" w:sz="4"/>
+              <w:bottom w:val="single" w:color="BFC9C4" w:sz="4"/>
+              <w:right w:val="single" w:color="BFC9C4" w:sz="4"/>
+            </w:tcBorders>
+            <w:tcMar>
+              <w:top w:type="dxa" w:w="80"/>
+              <w:left w:type="dxa" w:w="110"/>
+              <w:bottom w:type="dxa" w:w="80"/>
+              <w:right w:type="dxa" w:w="110"/>
+            </w:tcMar>
+          </w:tcPr>
+          <w:p>
+            <w:pPr>
+              <w:spacing w:after="0" w:line="270"/>
+            </w:pPr>
+            <w:r>
+              <w:rPr>
+                <w:rFonts w:ascii="Calibri" w:cs="Calibri" w:eastAsia="Calibri" w:hAnsi="Calibri"/>
+                <w:b w:val="false"/>
+                <w:bCs w:val="false"/>
+                <w:color w:val="222222"/>
+                <w:sz w:val="20"/>
+                <w:szCs w:val="20"/>
+              </w:rPr>
+              <w:t xml:space="preserve">Aprovado manualmente, sucesso em 1m16s, smoke test OK</w:t>
+            </w:r>
+          </w:p>
+        </w:tc>
+      </w:tr>
+    </w:tbl>
     <w:p>
       <w:pPr>
         <w:pStyle w:val="Heading1"/>
@@ -2225,7 +2692,7 @@
                 <w:sz w:val="20"/>
                 <w:szCs w:val="20"/>
               </w:rPr>
-              <w:t xml:space="preserve">ghcr.io/&lt;usuario&gt;/&lt;repositorio&gt;:sha-&lt;commit&gt; (e :latest)</w:t>
+              <w:t xml:space="preserve">ghcr.io/heyblurryface/elos-esg-api:sha-2b0edc4 (e :latest)</w:t>
             </w:r>
           </w:p>
         </w:tc>
@@ -3526,80 +3993,69 @@
         <w:t xml:space="preserve">Figura 1. Execução completa do pipeline</w:t>
       </w:r>
     </w:p>
-    <w:tbl>
-      <w:tblPr>
-        <w:tblW w:type="dxa" w:w="9638"/>
-        <w:tblBorders>
-          <w:top w:val="single" w:color="auto" w:sz="4"/>
-          <w:left w:val="single" w:color="auto" w:sz="4"/>
-          <w:bottom w:val="single" w:color="auto" w:sz="4"/>
-          <w:right w:val="single" w:color="auto" w:sz="4"/>
-          <w:insideH w:val="single" w:color="auto" w:sz="4"/>
-          <w:insideV w:val="single" w:color="auto" w:sz="4"/>
-        </w:tblBorders>
-      </w:tblPr>
-      <w:tblGrid>
-        <w:gridCol w:w="9638"/>
-      </w:tblGrid>
-      <w:tr>
-        <w:trPr>
-          <w:trHeight w:val="3600" w:hRule="atLeast"/>
-        </w:trPr>
-        <w:tc>
-          <w:tcPr>
-            <w:tcW w:type="dxa" w:w="9638"/>
-            <w:tcBorders>
-              <w:top w:val="dashed" w:color="7FA996" w:sz="8"/>
-              <w:left w:val="dashed" w:color="7FA996" w:sz="8"/>
-              <w:bottom w:val="dashed" w:color="7FA996" w:sz="8"/>
-              <w:right w:val="dashed" w:color="7FA996" w:sz="8"/>
-            </w:tcBorders>
-            <w:shd w:fill="F7FAF8" w:color="auto" w:val="clear"/>
-            <w:tcMar>
-              <w:top w:type="dxa" w:w="200"/>
-              <w:left w:type="dxa" w:w="200"/>
-              <w:bottom w:type="dxa" w:w="200"/>
-              <w:right w:type="dxa" w:w="200"/>
-            </w:tcMar>
-            <w:vAlign w:val="center"/>
-          </w:tcPr>
-          <w:p>
-            <w:pPr>
-              <w:spacing w:after="60"/>
-              <w:jc w:val="center"/>
-            </w:pPr>
-            <w:r>
-              <w:rPr>
-                <w:rFonts w:ascii="Calibri" w:cs="Calibri" w:eastAsia="Calibri" w:hAnsi="Calibri"/>
-                <w:b/>
-                <w:bCs/>
-                <w:color w:val="7FA996"/>
-                <w:sz w:val="22"/>
-                <w:szCs w:val="22"/>
-              </w:rPr>
-              <w:t xml:space="preserve">[ colar o print aqui ]</w:t>
-            </w:r>
-          </w:p>
-          <w:p>
-            <w:pPr>
-              <w:spacing w:after="0"/>
-              <w:jc w:val="center"/>
-            </w:pPr>
-            <w:r>
-              <w:rPr>
-                <w:rFonts w:ascii="Calibri" w:cs="Calibri" w:eastAsia="Calibri" w:hAnsi="Calibri"/>
-                <w:i/>
-                <w:iCs/>
-                <w:color w:val="6B7C74"/>
-                <w:sz w:val="19"/>
-                <w:szCs w:val="19"/>
-              </w:rPr>
-              <w:t xml:space="preserve">Actions &gt; execução da main com os 4 jobs verdes (grafo do workflow)</w:t>
-            </w:r>
-          </w:p>
-        </w:tc>
-      </w:tr>
-    </w:tbl>
+    <w:p>
+      <w:pPr>
+        <w:keepNext/>
+        <w:spacing w:after="60"/>
+        <w:jc w:val="center"/>
+      </w:pPr>
+      <w:r>
+        <w:drawing>
+          <wp:inline distT="0" distB="0" distL="0" distR="0">
+            <wp:extent cx="6096000" cy="2143125"/>
+            <wp:effectExtent t="0" r="0" b="0" l="0"/>
+            <wp:docPr id="1" name="" descr="" title=""/>
+            <wp:cNvGraphicFramePr>
+              <a:graphicFrameLocks xmlns:a="http://schemas.openxmlformats.org/drawingml/2006/main" noChangeAspect="1"/>
+            </wp:cNvGraphicFramePr>
+            <a:graphic xmlns:a="http://schemas.openxmlformats.org/drawingml/2006/main">
+              <a:graphicData uri="http://schemas.openxmlformats.org/drawingml/2006/picture">
+                <pic:pic xmlns:pic="http://schemas.openxmlformats.org/drawingml/2006/picture">
+                  <pic:nvPicPr>
+                    <pic:cNvPr id="0" name="" descr=""/>
+                    <pic:cNvPicPr>
+                      <a:picLocks noChangeAspect="1" noChangeArrowheads="1"/>
+                    </pic:cNvPicPr>
+                  </pic:nvPicPr>
+                  <pic:blipFill>
+                    <a:blip r:embed="rId8" cstate="none"/>
+                    <a:srcRect/>
+                    <a:stretch>
+                      <a:fillRect/>
+                    </a:stretch>
+                  </pic:blipFill>
+                  <pic:spPr bwMode="auto">
+                    <a:xfrm>
+                      <a:off x="0" y="0"/>
+                      <a:ext cx="6096000" cy="2143125"/>
+                    </a:xfrm>
+                    <a:prstGeom prst="rect">
+                      <a:avLst/>
+                    </a:prstGeom>
+                  </pic:spPr>
+                </pic:pic>
+              </a:graphicData>
+            </a:graphic>
+          </wp:inline>
+        </w:drawing>
+      </w:r>
+    </w:p>
+    <w:p>
+      <w:pPr>
+        <w:spacing w:after="160"/>
+      </w:pPr>
+      <w:r>
+        <w:rPr>
+          <w:rFonts w:ascii="Calibri" w:cs="Calibri" w:eastAsia="Calibri" w:hAnsi="Calibri"/>
+          <w:i/>
+          <w:iCs/>
+          <w:color w:val="6B7C74"/>
+          <w:sz w:val="19"/>
+          <w:szCs w:val="19"/>
+        </w:rPr>
+        <w:t xml:space="preserve">Execução #2 do workflow com os 4 jobs concluídos com sucesso.</w:t>
+      </w:r>
+    </w:p>
     <w:p>
       <w:pPr>
         <w:keepNext/>
@@ -3617,80 +4073,69 @@
         <w:t xml:space="preserve">Figura 2. Build e testes automatizados</w:t>
       </w:r>
     </w:p>
-    <w:tbl>
-      <w:tblPr>
-        <w:tblW w:type="dxa" w:w="9638"/>
-        <w:tblBorders>
-          <w:top w:val="single" w:color="auto" w:sz="4"/>
-          <w:left w:val="single" w:color="auto" w:sz="4"/>
-          <w:bottom w:val="single" w:color="auto" w:sz="4"/>
-          <w:right w:val="single" w:color="auto" w:sz="4"/>
-          <w:insideH w:val="single" w:color="auto" w:sz="4"/>
-          <w:insideV w:val="single" w:color="auto" w:sz="4"/>
-        </w:tblBorders>
-      </w:tblPr>
-      <w:tblGrid>
-        <w:gridCol w:w="9638"/>
-      </w:tblGrid>
-      <w:tr>
-        <w:trPr>
-          <w:trHeight w:val="3600" w:hRule="atLeast"/>
-        </w:trPr>
-        <w:tc>
-          <w:tcPr>
-            <w:tcW w:type="dxa" w:w="9638"/>
-            <w:tcBorders>
-              <w:top w:val="dashed" w:color="7FA996" w:sz="8"/>
-              <w:left w:val="dashed" w:color="7FA996" w:sz="8"/>
-              <w:bottom w:val="dashed" w:color="7FA996" w:sz="8"/>
-              <w:right w:val="dashed" w:color="7FA996" w:sz="8"/>
-            </w:tcBorders>
-            <w:shd w:fill="F7FAF8" w:color="auto" w:val="clear"/>
-            <w:tcMar>
-              <w:top w:type="dxa" w:w="200"/>
-              <w:left w:type="dxa" w:w="200"/>
-              <w:bottom w:type="dxa" w:w="200"/>
-              <w:right w:type="dxa" w:w="200"/>
-            </w:tcMar>
-            <w:vAlign w:val="center"/>
-          </w:tcPr>
-          <w:p>
-            <w:pPr>
-              <w:spacing w:after="60"/>
-              <w:jc w:val="center"/>
-            </w:pPr>
-            <w:r>
-              <w:rPr>
-                <w:rFonts w:ascii="Calibri" w:cs="Calibri" w:eastAsia="Calibri" w:hAnsi="Calibri"/>
-                <w:b/>
-                <w:bCs/>
-                <w:color w:val="7FA996"/>
-                <w:sz w:val="22"/>
-                <w:szCs w:val="22"/>
-              </w:rPr>
-              <w:t xml:space="preserve">[ colar o print aqui ]</w:t>
-            </w:r>
-          </w:p>
-          <w:p>
-            <w:pPr>
-              <w:spacing w:after="0"/>
-              <w:jc w:val="center"/>
-            </w:pPr>
-            <w:r>
-              <w:rPr>
-                <w:rFonts w:ascii="Calibri" w:cs="Calibri" w:eastAsia="Calibri" w:hAnsi="Calibri"/>
-                <w:i/>
-                <w:iCs/>
-                <w:color w:val="6B7C74"/>
-                <w:sz w:val="19"/>
-                <w:szCs w:val="19"/>
-              </w:rPr>
-              <w:t xml:space="preserve">Job "Build e testes": passo dos testes ou o resumo com 26 testes aprovados</w:t>
-            </w:r>
-          </w:p>
-        </w:tc>
-      </w:tr>
-    </w:tbl>
+    <w:p>
+      <w:pPr>
+        <w:keepNext/>
+        <w:spacing w:after="60"/>
+        <w:jc w:val="center"/>
+      </w:pPr>
+      <w:r>
+        <w:drawing>
+          <wp:inline distT="0" distB="0" distL="0" distR="0">
+            <wp:extent cx="6096000" cy="1800225"/>
+            <wp:effectExtent t="0" r="0" b="0" l="0"/>
+            <wp:docPr id="1" name="" descr="" title=""/>
+            <wp:cNvGraphicFramePr>
+              <a:graphicFrameLocks xmlns:a="http://schemas.openxmlformats.org/drawingml/2006/main" noChangeAspect="1"/>
+            </wp:cNvGraphicFramePr>
+            <a:graphic xmlns:a="http://schemas.openxmlformats.org/drawingml/2006/main">
+              <a:graphicData uri="http://schemas.openxmlformats.org/drawingml/2006/picture">
+                <pic:pic xmlns:pic="http://schemas.openxmlformats.org/drawingml/2006/picture">
+                  <pic:nvPicPr>
+                    <pic:cNvPr id="0" name="" descr=""/>
+                    <pic:cNvPicPr>
+                      <a:picLocks noChangeAspect="1" noChangeArrowheads="1"/>
+                    </pic:cNvPicPr>
+                  </pic:nvPicPr>
+                  <pic:blipFill>
+                    <a:blip r:embed="rId9" cstate="none"/>
+                    <a:srcRect/>
+                    <a:stretch>
+                      <a:fillRect/>
+                    </a:stretch>
+                  </pic:blipFill>
+                  <pic:spPr bwMode="auto">
+                    <a:xfrm>
+                      <a:off x="0" y="0"/>
+                      <a:ext cx="6096000" cy="1800225"/>
+                    </a:xfrm>
+                    <a:prstGeom prst="rect">
+                      <a:avLst/>
+                    </a:prstGeom>
+                  </pic:spPr>
+                </pic:pic>
+              </a:graphicData>
+            </a:graphic>
+          </wp:inline>
+        </w:drawing>
+      </w:r>
+    </w:p>
+    <w:p>
+      <w:pPr>
+        <w:spacing w:after="160"/>
+      </w:pPr>
+      <w:r>
+        <w:rPr>
+          <w:rFonts w:ascii="Calibri" w:cs="Calibri" w:eastAsia="Calibri" w:hAnsi="Calibri"/>
+          <w:i/>
+          <w:iCs/>
+          <w:color w:val="6B7C74"/>
+          <w:sz w:val="19"/>
+          <w:szCs w:val="19"/>
+        </w:rPr>
+        <w:t xml:space="preserve">Passo de testes do job Build e testes: 26 testes executados e 26 aprovados.</w:t>
+      </w:r>
+    </w:p>
     <w:p>
       <w:pPr>
         <w:keepNext/>
@@ -3708,80 +4153,69 @@
         <w:t xml:space="preserve">Figura 3. Imagem publicada no GHCR</w:t>
       </w:r>
     </w:p>
-    <w:tbl>
-      <w:tblPr>
-        <w:tblW w:type="dxa" w:w="9638"/>
-        <w:tblBorders>
-          <w:top w:val="single" w:color="auto" w:sz="4"/>
-          <w:left w:val="single" w:color="auto" w:sz="4"/>
-          <w:bottom w:val="single" w:color="auto" w:sz="4"/>
-          <w:right w:val="single" w:color="auto" w:sz="4"/>
-          <w:insideH w:val="single" w:color="auto" w:sz="4"/>
-          <w:insideV w:val="single" w:color="auto" w:sz="4"/>
-        </w:tblBorders>
-      </w:tblPr>
-      <w:tblGrid>
-        <w:gridCol w:w="9638"/>
-      </w:tblGrid>
-      <w:tr>
-        <w:trPr>
-          <w:trHeight w:val="3600" w:hRule="atLeast"/>
-        </w:trPr>
-        <w:tc>
-          <w:tcPr>
-            <w:tcW w:type="dxa" w:w="9638"/>
-            <w:tcBorders>
-              <w:top w:val="dashed" w:color="7FA996" w:sz="8"/>
-              <w:left w:val="dashed" w:color="7FA996" w:sz="8"/>
-              <w:bottom w:val="dashed" w:color="7FA996" w:sz="8"/>
-              <w:right w:val="dashed" w:color="7FA996" w:sz="8"/>
-            </w:tcBorders>
-            <w:shd w:fill="F7FAF8" w:color="auto" w:val="clear"/>
-            <w:tcMar>
-              <w:top w:type="dxa" w:w="200"/>
-              <w:left w:type="dxa" w:w="200"/>
-              <w:bottom w:type="dxa" w:w="200"/>
-              <w:right w:type="dxa" w:w="200"/>
-            </w:tcMar>
-            <w:vAlign w:val="center"/>
-          </w:tcPr>
-          <w:p>
-            <w:pPr>
-              <w:spacing w:after="60"/>
-              <w:jc w:val="center"/>
-            </w:pPr>
-            <w:r>
-              <w:rPr>
-                <w:rFonts w:ascii="Calibri" w:cs="Calibri" w:eastAsia="Calibri" w:hAnsi="Calibri"/>
-                <w:b/>
-                <w:bCs/>
-                <w:color w:val="7FA996"/>
-                <w:sz w:val="22"/>
-                <w:szCs w:val="22"/>
-              </w:rPr>
-              <w:t xml:space="preserve">[ colar o print aqui ]</w:t>
-            </w:r>
-          </w:p>
-          <w:p>
-            <w:pPr>
-              <w:spacing w:after="0"/>
-              <w:jc w:val="center"/>
-            </w:pPr>
-            <w:r>
-              <w:rPr>
-                <w:rFonts w:ascii="Calibri" w:cs="Calibri" w:eastAsia="Calibri" w:hAnsi="Calibri"/>
-                <w:i/>
-                <w:iCs/>
-                <w:color w:val="6B7C74"/>
-                <w:sz w:val="19"/>
-                <w:szCs w:val="19"/>
-              </w:rPr>
-              <w:t xml:space="preserve">Job "Imagem Docker" ou a página do pacote com a tag sha-&lt;commit&gt;</w:t>
-            </w:r>
-          </w:p>
-        </w:tc>
-      </w:tr>
-    </w:tbl>
+    <w:p>
+      <w:pPr>
+        <w:keepNext/>
+        <w:spacing w:after="60"/>
+        <w:jc w:val="center"/>
+      </w:pPr>
+      <w:r>
+        <w:drawing>
+          <wp:inline distT="0" distB="0" distL="0" distR="0">
+            <wp:extent cx="6096000" cy="3705225"/>
+            <wp:effectExtent t="0" r="0" b="0" l="0"/>
+            <wp:docPr id="1" name="" descr="" title=""/>
+            <wp:cNvGraphicFramePr>
+              <a:graphicFrameLocks xmlns:a="http://schemas.openxmlformats.org/drawingml/2006/main" noChangeAspect="1"/>
+            </wp:cNvGraphicFramePr>
+            <a:graphic xmlns:a="http://schemas.openxmlformats.org/drawingml/2006/main">
+              <a:graphicData uri="http://schemas.openxmlformats.org/drawingml/2006/picture">
+                <pic:pic xmlns:pic="http://schemas.openxmlformats.org/drawingml/2006/picture">
+                  <pic:nvPicPr>
+                    <pic:cNvPr id="0" name="" descr=""/>
+                    <pic:cNvPicPr>
+                      <a:picLocks noChangeAspect="1" noChangeArrowheads="1"/>
+                    </pic:cNvPicPr>
+                  </pic:nvPicPr>
+                  <pic:blipFill>
+                    <a:blip r:embed="rId10" cstate="none"/>
+                    <a:srcRect/>
+                    <a:stretch>
+                      <a:fillRect/>
+                    </a:stretch>
+                  </pic:blipFill>
+                  <pic:spPr bwMode="auto">
+                    <a:xfrm>
+                      <a:off x="0" y="0"/>
+                      <a:ext cx="6096000" cy="3705225"/>
+                    </a:xfrm>
+                    <a:prstGeom prst="rect">
+                      <a:avLst/>
+                    </a:prstGeom>
+                  </pic:spPr>
+                </pic:pic>
+              </a:graphicData>
+            </a:graphic>
+          </wp:inline>
+        </w:drawing>
+      </w:r>
+    </w:p>
+    <w:p>
+      <w:pPr>
+        <w:spacing w:after="160"/>
+      </w:pPr>
+      <w:r>
+        <w:rPr>
+          <w:rFonts w:ascii="Calibri" w:cs="Calibri" w:eastAsia="Calibri" w:hAnsi="Calibri"/>
+          <w:i/>
+          <w:iCs/>
+          <w:color w:val="6B7C74"/>
+          <w:sz w:val="19"/>
+          <w:szCs w:val="19"/>
+        </w:rPr>
+        <w:t xml:space="preserve">Etapas do job de imagem: validação do compose, Buildx, login no GHCR e build/push.</w:t>
+      </w:r>
+    </w:p>
     <w:p>
       <w:pPr>
         <w:keepNext/>
@@ -3799,80 +4233,69 @@
         <w:t xml:space="preserve">Figura 4. Deploy em staging</w:t>
       </w:r>
     </w:p>
-    <w:tbl>
-      <w:tblPr>
-        <w:tblW w:type="dxa" w:w="9638"/>
-        <w:tblBorders>
-          <w:top w:val="single" w:color="auto" w:sz="4"/>
-          <w:left w:val="single" w:color="auto" w:sz="4"/>
-          <w:bottom w:val="single" w:color="auto" w:sz="4"/>
-          <w:right w:val="single" w:color="auto" w:sz="4"/>
-          <w:insideH w:val="single" w:color="auto" w:sz="4"/>
-          <w:insideV w:val="single" w:color="auto" w:sz="4"/>
-        </w:tblBorders>
-      </w:tblPr>
-      <w:tblGrid>
-        <w:gridCol w:w="9638"/>
-      </w:tblGrid>
-      <w:tr>
-        <w:trPr>
-          <w:trHeight w:val="3600" w:hRule="atLeast"/>
-        </w:trPr>
-        <w:tc>
-          <w:tcPr>
-            <w:tcW w:type="dxa" w:w="9638"/>
-            <w:tcBorders>
-              <w:top w:val="dashed" w:color="7FA996" w:sz="8"/>
-              <w:left w:val="dashed" w:color="7FA996" w:sz="8"/>
-              <w:bottom w:val="dashed" w:color="7FA996" w:sz="8"/>
-              <w:right w:val="dashed" w:color="7FA996" w:sz="8"/>
-            </w:tcBorders>
-            <w:shd w:fill="F7FAF8" w:color="auto" w:val="clear"/>
-            <w:tcMar>
-              <w:top w:type="dxa" w:w="200"/>
-              <w:left w:type="dxa" w:w="200"/>
-              <w:bottom w:type="dxa" w:w="200"/>
-              <w:right w:type="dxa" w:w="200"/>
-            </w:tcMar>
-            <w:vAlign w:val="center"/>
-          </w:tcPr>
-          <w:p>
-            <w:pPr>
-              <w:spacing w:after="60"/>
-              <w:jc w:val="center"/>
-            </w:pPr>
-            <w:r>
-              <w:rPr>
-                <w:rFonts w:ascii="Calibri" w:cs="Calibri" w:eastAsia="Calibri" w:hAnsi="Calibri"/>
-                <w:b/>
-                <w:bCs/>
-                <w:color w:val="7FA996"/>
-                <w:sz w:val="22"/>
-                <w:szCs w:val="22"/>
-              </w:rPr>
-              <w:t xml:space="preserve">[ colar o print aqui ]</w:t>
-            </w:r>
-          </w:p>
-          <w:p>
-            <w:pPr>
-              <w:spacing w:after="0"/>
-              <w:jc w:val="center"/>
-            </w:pPr>
-            <w:r>
-              <w:rPr>
-                <w:rFonts w:ascii="Calibri" w:cs="Calibri" w:eastAsia="Calibri" w:hAnsi="Calibri"/>
-                <w:i/>
-                <w:iCs/>
-                <w:color w:val="6B7C74"/>
-                <w:sz w:val="19"/>
-                <w:szCs w:val="19"/>
-              </w:rPr>
-              <w:t xml:space="preserve">Job "Deploy staging" com o docker compose e o smoke test OK</w:t>
-            </w:r>
-          </w:p>
-        </w:tc>
-      </w:tr>
-    </w:tbl>
+    <w:p>
+      <w:pPr>
+        <w:keepNext/>
+        <w:spacing w:after="60"/>
+        <w:jc w:val="center"/>
+      </w:pPr>
+      <w:r>
+        <w:drawing>
+          <wp:inline distT="0" distB="0" distL="0" distR="0">
+            <wp:extent cx="6096000" cy="4648200"/>
+            <wp:effectExtent t="0" r="0" b="0" l="0"/>
+            <wp:docPr id="1" name="" descr="" title=""/>
+            <wp:cNvGraphicFramePr>
+              <a:graphicFrameLocks xmlns:a="http://schemas.openxmlformats.org/drawingml/2006/main" noChangeAspect="1"/>
+            </wp:cNvGraphicFramePr>
+            <a:graphic xmlns:a="http://schemas.openxmlformats.org/drawingml/2006/main">
+              <a:graphicData uri="http://schemas.openxmlformats.org/drawingml/2006/picture">
+                <pic:pic xmlns:pic="http://schemas.openxmlformats.org/drawingml/2006/picture">
+                  <pic:nvPicPr>
+                    <pic:cNvPr id="0" name="" descr=""/>
+                    <pic:cNvPicPr>
+                      <a:picLocks noChangeAspect="1" noChangeArrowheads="1"/>
+                    </pic:cNvPicPr>
+                  </pic:nvPicPr>
+                  <pic:blipFill>
+                    <a:blip r:embed="rId11" cstate="none"/>
+                    <a:srcRect/>
+                    <a:stretch>
+                      <a:fillRect/>
+                    </a:stretch>
+                  </pic:blipFill>
+                  <pic:spPr bwMode="auto">
+                    <a:xfrm>
+                      <a:off x="0" y="0"/>
+                      <a:ext cx="6096000" cy="4648200"/>
+                    </a:xfrm>
+                    <a:prstGeom prst="rect">
+                      <a:avLst/>
+                    </a:prstGeom>
+                  </pic:spPr>
+                </pic:pic>
+              </a:graphicData>
+            </a:graphic>
+          </wp:inline>
+        </w:drawing>
+      </w:r>
+    </w:p>
+    <w:p>
+      <w:pPr>
+        <w:spacing w:after="160"/>
+      </w:pPr>
+      <w:r>
+        <w:rPr>
+          <w:rFonts w:ascii="Calibri" w:cs="Calibri" w:eastAsia="Calibri" w:hAnsi="Calibri"/>
+          <w:i/>
+          <w:iCs/>
+          <w:color w:val="6B7C74"/>
+          <w:sz w:val="19"/>
+          <w:szCs w:val="19"/>
+        </w:rPr>
+        <w:t xml:space="preserve">Smoke test em staging: health com a versão 2b0edc4, login JWT e GET /api/empresas com HTTP 200.</w:t>
+      </w:r>
+    </w:p>
     <w:p>
       <w:pPr>
         <w:keepNext/>
@@ -3890,80 +4313,69 @@
         <w:t xml:space="preserve">Figura 5. Aprovação manual de produção</w:t>
       </w:r>
     </w:p>
-    <w:tbl>
-      <w:tblPr>
-        <w:tblW w:type="dxa" w:w="9638"/>
-        <w:tblBorders>
-          <w:top w:val="single" w:color="auto" w:sz="4"/>
-          <w:left w:val="single" w:color="auto" w:sz="4"/>
-          <w:bottom w:val="single" w:color="auto" w:sz="4"/>
-          <w:right w:val="single" w:color="auto" w:sz="4"/>
-          <w:insideH w:val="single" w:color="auto" w:sz="4"/>
-          <w:insideV w:val="single" w:color="auto" w:sz="4"/>
-        </w:tblBorders>
-      </w:tblPr>
-      <w:tblGrid>
-        <w:gridCol w:w="9638"/>
-      </w:tblGrid>
-      <w:tr>
-        <w:trPr>
-          <w:trHeight w:val="3600" w:hRule="atLeast"/>
-        </w:trPr>
-        <w:tc>
-          <w:tcPr>
-            <w:tcW w:type="dxa" w:w="9638"/>
-            <w:tcBorders>
-              <w:top w:val="dashed" w:color="7FA996" w:sz="8"/>
-              <w:left w:val="dashed" w:color="7FA996" w:sz="8"/>
-              <w:bottom w:val="dashed" w:color="7FA996" w:sz="8"/>
-              <w:right w:val="dashed" w:color="7FA996" w:sz="8"/>
-            </w:tcBorders>
-            <w:shd w:fill="F7FAF8" w:color="auto" w:val="clear"/>
-            <w:tcMar>
-              <w:top w:type="dxa" w:w="200"/>
-              <w:left w:type="dxa" w:w="200"/>
-              <w:bottom w:type="dxa" w:w="200"/>
-              <w:right w:type="dxa" w:w="200"/>
-            </w:tcMar>
-            <w:vAlign w:val="center"/>
-          </w:tcPr>
-          <w:p>
-            <w:pPr>
-              <w:spacing w:after="60"/>
-              <w:jc w:val="center"/>
-            </w:pPr>
-            <w:r>
-              <w:rPr>
-                <w:rFonts w:ascii="Calibri" w:cs="Calibri" w:eastAsia="Calibri" w:hAnsi="Calibri"/>
-                <w:b/>
-                <w:bCs/>
-                <w:color w:val="7FA996"/>
-                <w:sz w:val="22"/>
-                <w:szCs w:val="22"/>
-              </w:rPr>
-              <w:t xml:space="preserve">[ colar o print aqui ]</w:t>
-            </w:r>
-          </w:p>
-          <w:p>
-            <w:pPr>
-              <w:spacing w:after="0"/>
-              <w:jc w:val="center"/>
-            </w:pPr>
-            <w:r>
-              <w:rPr>
-                <w:rFonts w:ascii="Calibri" w:cs="Calibri" w:eastAsia="Calibri" w:hAnsi="Calibri"/>
-                <w:i/>
-                <w:iCs/>
-                <w:color w:val="6B7C74"/>
-                <w:sz w:val="19"/>
-                <w:szCs w:val="19"/>
-              </w:rPr>
-              <w:t xml:space="preserve">Tela "Review deployments" com o environment production</w:t>
-            </w:r>
-          </w:p>
-        </w:tc>
-      </w:tr>
-    </w:tbl>
+    <w:p>
+      <w:pPr>
+        <w:keepNext/>
+        <w:spacing w:after="60"/>
+        <w:jc w:val="center"/>
+      </w:pPr>
+      <w:r>
+        <w:drawing>
+          <wp:inline distT="0" distB="0" distL="0" distR="0">
+            <wp:extent cx="6096000" cy="3695700"/>
+            <wp:effectExtent t="0" r="0" b="0" l="0"/>
+            <wp:docPr id="1" name="" descr="" title=""/>
+            <wp:cNvGraphicFramePr>
+              <a:graphicFrameLocks xmlns:a="http://schemas.openxmlformats.org/drawingml/2006/main" noChangeAspect="1"/>
+            </wp:cNvGraphicFramePr>
+            <a:graphic xmlns:a="http://schemas.openxmlformats.org/drawingml/2006/main">
+              <a:graphicData uri="http://schemas.openxmlformats.org/drawingml/2006/picture">
+                <pic:pic xmlns:pic="http://schemas.openxmlformats.org/drawingml/2006/picture">
+                  <pic:nvPicPr>
+                    <pic:cNvPr id="0" name="" descr=""/>
+                    <pic:cNvPicPr>
+                      <a:picLocks noChangeAspect="1" noChangeArrowheads="1"/>
+                    </pic:cNvPicPr>
+                  </pic:nvPicPr>
+                  <pic:blipFill>
+                    <a:blip r:embed="rId12" cstate="none"/>
+                    <a:srcRect/>
+                    <a:stretch>
+                      <a:fillRect/>
+                    </a:stretch>
+                  </pic:blipFill>
+                  <pic:spPr bwMode="auto">
+                    <a:xfrm>
+                      <a:off x="0" y="0"/>
+                      <a:ext cx="6096000" cy="3695700"/>
+                    </a:xfrm>
+                    <a:prstGeom prst="rect">
+                      <a:avLst/>
+                    </a:prstGeom>
+                  </pic:spPr>
+                </pic:pic>
+              </a:graphicData>
+            </a:graphic>
+          </wp:inline>
+        </w:drawing>
+      </w:r>
+    </w:p>
+    <w:p>
+      <w:pPr>
+        <w:spacing w:after="160"/>
+      </w:pPr>
+      <w:r>
+        <w:rPr>
+          <w:rFonts w:ascii="Calibri" w:cs="Calibri" w:eastAsia="Calibri" w:hAnsi="Calibri"/>
+          <w:i/>
+          <w:iCs/>
+          <w:color w:val="6B7C74"/>
+          <w:sz w:val="19"/>
+          <w:szCs w:val="19"/>
+        </w:rPr>
+        <w:t xml:space="preserve">Aprovação manual exigida pelo environment production antes do deploy.</w:t>
+      </w:r>
+    </w:p>
     <w:p>
       <w:pPr>
         <w:keepNext/>
@@ -3981,83 +4393,67 @@
         <w:t xml:space="preserve">Figura 6. Deploy em produção</w:t>
       </w:r>
     </w:p>
-    <w:tbl>
-      <w:tblPr>
-        <w:tblW w:type="dxa" w:w="9638"/>
-        <w:tblBorders>
-          <w:top w:val="single" w:color="auto" w:sz="4"/>
-          <w:left w:val="single" w:color="auto" w:sz="4"/>
-          <w:bottom w:val="single" w:color="auto" w:sz="4"/>
-          <w:right w:val="single" w:color="auto" w:sz="4"/>
-          <w:insideH w:val="single" w:color="auto" w:sz="4"/>
-          <w:insideV w:val="single" w:color="auto" w:sz="4"/>
-        </w:tblBorders>
-      </w:tblPr>
-      <w:tblGrid>
-        <w:gridCol w:w="9638"/>
-      </w:tblGrid>
-      <w:tr>
-        <w:trPr>
-          <w:trHeight w:val="3600" w:hRule="atLeast"/>
-        </w:trPr>
-        <w:tc>
-          <w:tcPr>
-            <w:tcW w:type="dxa" w:w="9638"/>
-            <w:tcBorders>
-              <w:top w:val="dashed" w:color="7FA996" w:sz="8"/>
-              <w:left w:val="dashed" w:color="7FA996" w:sz="8"/>
-              <w:bottom w:val="dashed" w:color="7FA996" w:sz="8"/>
-              <w:right w:val="dashed" w:color="7FA996" w:sz="8"/>
-            </w:tcBorders>
-            <w:shd w:fill="F7FAF8" w:color="auto" w:val="clear"/>
-            <w:tcMar>
-              <w:top w:type="dxa" w:w="200"/>
-              <w:left w:type="dxa" w:w="200"/>
-              <w:bottom w:type="dxa" w:w="200"/>
-              <w:right w:type="dxa" w:w="200"/>
-            </w:tcMar>
-            <w:vAlign w:val="center"/>
-          </w:tcPr>
-          <w:p>
-            <w:pPr>
-              <w:spacing w:after="60"/>
-              <w:jc w:val="center"/>
-            </w:pPr>
-            <w:r>
-              <w:rPr>
-                <w:rFonts w:ascii="Calibri" w:cs="Calibri" w:eastAsia="Calibri" w:hAnsi="Calibri"/>
-                <w:b/>
-                <w:bCs/>
-                <w:color w:val="7FA996"/>
-                <w:sz w:val="22"/>
-                <w:szCs w:val="22"/>
-              </w:rPr>
-              <w:t xml:space="preserve">[ colar o print aqui ]</w:t>
-            </w:r>
-          </w:p>
-          <w:p>
-            <w:pPr>
-              <w:spacing w:after="0"/>
-              <w:jc w:val="center"/>
-            </w:pPr>
-            <w:r>
-              <w:rPr>
-                <w:rFonts w:ascii="Calibri" w:cs="Calibri" w:eastAsia="Calibri" w:hAnsi="Calibri"/>
-                <w:i/>
-                <w:iCs/>
-                <w:color w:val="6B7C74"/>
-                <w:sz w:val="19"/>
-                <w:szCs w:val="19"/>
-              </w:rPr>
-              <w:t xml:space="preserve">Job "Deploy production" com o smoke test OK</w:t>
-            </w:r>
-          </w:p>
-        </w:tc>
-      </w:tr>
-    </w:tbl>
-    <w:p>
-      <w:r>
-        <w:br w:type="page"/>
+    <w:p>
+      <w:pPr>
+        <w:keepNext/>
+        <w:spacing w:after="60"/>
+        <w:jc w:val="center"/>
+      </w:pPr>
+      <w:r>
+        <w:drawing>
+          <wp:inline distT="0" distB="0" distL="0" distR="0">
+            <wp:extent cx="6096000" cy="4495800"/>
+            <wp:effectExtent t="0" r="0" b="0" l="0"/>
+            <wp:docPr id="1" name="" descr="" title=""/>
+            <wp:cNvGraphicFramePr>
+              <a:graphicFrameLocks xmlns:a="http://schemas.openxmlformats.org/drawingml/2006/main" noChangeAspect="1"/>
+            </wp:cNvGraphicFramePr>
+            <a:graphic xmlns:a="http://schemas.openxmlformats.org/drawingml/2006/main">
+              <a:graphicData uri="http://schemas.openxmlformats.org/drawingml/2006/picture">
+                <pic:pic xmlns:pic="http://schemas.openxmlformats.org/drawingml/2006/picture">
+                  <pic:nvPicPr>
+                    <pic:cNvPr id="0" name="" descr=""/>
+                    <pic:cNvPicPr>
+                      <a:picLocks noChangeAspect="1" noChangeArrowheads="1"/>
+                    </pic:cNvPicPr>
+                  </pic:nvPicPr>
+                  <pic:blipFill>
+                    <a:blip r:embed="rId13" cstate="none"/>
+                    <a:srcRect/>
+                    <a:stretch>
+                      <a:fillRect/>
+                    </a:stretch>
+                  </pic:blipFill>
+                  <pic:spPr bwMode="auto">
+                    <a:xfrm>
+                      <a:off x="0" y="0"/>
+                      <a:ext cx="6096000" cy="4495800"/>
+                    </a:xfrm>
+                    <a:prstGeom prst="rect">
+                      <a:avLst/>
+                    </a:prstGeom>
+                  </pic:spPr>
+                </pic:pic>
+              </a:graphicData>
+            </a:graphic>
+          </wp:inline>
+        </w:drawing>
+      </w:r>
+    </w:p>
+    <w:p>
+      <w:pPr>
+        <w:spacing w:after="160"/>
+      </w:pPr>
+      <w:r>
+        <w:rPr>
+          <w:rFonts w:ascii="Calibri" w:cs="Calibri" w:eastAsia="Calibri" w:hAnsi="Calibri"/>
+          <w:i/>
+          <w:iCs/>
+          <w:color w:val="6B7C74"/>
+          <w:sz w:val="19"/>
+          <w:szCs w:val="19"/>
+        </w:rPr>
+        <w:t xml:space="preserve">Smoke test em produção com a mesma versão 2b0edc4 promovida de staging.</w:t>
       </w:r>
     </w:p>
     <w:p>
@@ -4086,80 +4482,69 @@
         <w:t xml:space="preserve">Figura 7. Staging funcionando</w:t>
       </w:r>
     </w:p>
-    <w:tbl>
-      <w:tblPr>
-        <w:tblW w:type="dxa" w:w="9638"/>
-        <w:tblBorders>
-          <w:top w:val="single" w:color="auto" w:sz="4"/>
-          <w:left w:val="single" w:color="auto" w:sz="4"/>
-          <w:bottom w:val="single" w:color="auto" w:sz="4"/>
-          <w:right w:val="single" w:color="auto" w:sz="4"/>
-          <w:insideH w:val="single" w:color="auto" w:sz="4"/>
-          <w:insideV w:val="single" w:color="auto" w:sz="4"/>
-        </w:tblBorders>
-      </w:tblPr>
-      <w:tblGrid>
-        <w:gridCol w:w="9638"/>
-      </w:tblGrid>
-      <w:tr>
-        <w:trPr>
-          <w:trHeight w:val="3600" w:hRule="atLeast"/>
-        </w:trPr>
-        <w:tc>
-          <w:tcPr>
-            <w:tcW w:type="dxa" w:w="9638"/>
-            <w:tcBorders>
-              <w:top w:val="dashed" w:color="7FA996" w:sz="8"/>
-              <w:left w:val="dashed" w:color="7FA996" w:sz="8"/>
-              <w:bottom w:val="dashed" w:color="7FA996" w:sz="8"/>
-              <w:right w:val="dashed" w:color="7FA996" w:sz="8"/>
-            </w:tcBorders>
-            <w:shd w:fill="F7FAF8" w:color="auto" w:val="clear"/>
-            <w:tcMar>
-              <w:top w:type="dxa" w:w="200"/>
-              <w:left w:type="dxa" w:w="200"/>
-              <w:bottom w:type="dxa" w:w="200"/>
-              <w:right w:type="dxa" w:w="200"/>
-            </w:tcMar>
-            <w:vAlign w:val="center"/>
-          </w:tcPr>
-          <w:p>
-            <w:pPr>
-              <w:spacing w:after="60"/>
-              <w:jc w:val="center"/>
-            </w:pPr>
-            <w:r>
-              <w:rPr>
-                <w:rFonts w:ascii="Calibri" w:cs="Calibri" w:eastAsia="Calibri" w:hAnsi="Calibri"/>
-                <w:b/>
-                <w:bCs/>
-                <w:color w:val="7FA996"/>
-                <w:sz w:val="22"/>
-                <w:szCs w:val="22"/>
-              </w:rPr>
-              <w:t xml:space="preserve">[ colar o print aqui ]</w:t>
-            </w:r>
-          </w:p>
-          <w:p>
-            <w:pPr>
-              <w:spacing w:after="0"/>
-              <w:jc w:val="center"/>
-            </w:pPr>
-            <w:r>
-              <w:rPr>
-                <w:rFonts w:ascii="Calibri" w:cs="Calibri" w:eastAsia="Calibri" w:hAnsi="Calibri"/>
-                <w:i/>
-                <w:iCs/>
-                <w:color w:val="6B7C74"/>
-                <w:sz w:val="19"/>
-                <w:szCs w:val="19"/>
-              </w:rPr>
-              <w:t xml:space="preserve">Navegador em http://&lt;IP&gt;:8081/health mostrando "environment":"Staging"</w:t>
-            </w:r>
-          </w:p>
-        </w:tc>
-      </w:tr>
-    </w:tbl>
+    <w:p>
+      <w:pPr>
+        <w:keepNext/>
+        <w:spacing w:after="60"/>
+        <w:jc w:val="center"/>
+      </w:pPr>
+      <w:r>
+        <w:drawing>
+          <wp:inline distT="0" distB="0" distL="0" distR="0">
+            <wp:extent cx="6096000" cy="695325"/>
+            <wp:effectExtent t="0" r="0" b="0" l="0"/>
+            <wp:docPr id="1" name="" descr="" title=""/>
+            <wp:cNvGraphicFramePr>
+              <a:graphicFrameLocks xmlns:a="http://schemas.openxmlformats.org/drawingml/2006/main" noChangeAspect="1"/>
+            </wp:cNvGraphicFramePr>
+            <a:graphic xmlns:a="http://schemas.openxmlformats.org/drawingml/2006/main">
+              <a:graphicData uri="http://schemas.openxmlformats.org/drawingml/2006/picture">
+                <pic:pic xmlns:pic="http://schemas.openxmlformats.org/drawingml/2006/picture">
+                  <pic:nvPicPr>
+                    <pic:cNvPr id="0" name="" descr=""/>
+                    <pic:cNvPicPr>
+                      <a:picLocks noChangeAspect="1" noChangeArrowheads="1"/>
+                    </pic:cNvPicPr>
+                  </pic:nvPicPr>
+                  <pic:blipFill>
+                    <a:blip r:embed="rId14" cstate="none"/>
+                    <a:srcRect/>
+                    <a:stretch>
+                      <a:fillRect/>
+                    </a:stretch>
+                  </pic:blipFill>
+                  <pic:spPr bwMode="auto">
+                    <a:xfrm>
+                      <a:off x="0" y="0"/>
+                      <a:ext cx="6096000" cy="695325"/>
+                    </a:xfrm>
+                    <a:prstGeom prst="rect">
+                      <a:avLst/>
+                    </a:prstGeom>
+                  </pic:spPr>
+                </pic:pic>
+              </a:graphicData>
+            </a:graphic>
+          </wp:inline>
+        </w:drawing>
+      </w:r>
+    </w:p>
+    <w:p>
+      <w:pPr>
+        <w:spacing w:after="160"/>
+      </w:pPr>
+      <w:r>
+        <w:rPr>
+          <w:rFonts w:ascii="Calibri" w:cs="Calibri" w:eastAsia="Calibri" w:hAnsi="Calibri"/>
+          <w:i/>
+          <w:iCs/>
+          <w:color w:val="6B7C74"/>
+          <w:sz w:val="19"/>
+          <w:szCs w:val="19"/>
+        </w:rPr>
+        <w:t xml:space="preserve">http://68.211.144.197:8081/health respondendo com environment Staging e banco Up.</w:t>
+      </w:r>
+    </w:p>
     <w:p>
       <w:pPr>
         <w:keepNext/>
@@ -4177,80 +4562,69 @@
         <w:t xml:space="preserve">Figura 8. Produção funcionando</w:t>
       </w:r>
     </w:p>
-    <w:tbl>
-      <w:tblPr>
-        <w:tblW w:type="dxa" w:w="9638"/>
-        <w:tblBorders>
-          <w:top w:val="single" w:color="auto" w:sz="4"/>
-          <w:left w:val="single" w:color="auto" w:sz="4"/>
-          <w:bottom w:val="single" w:color="auto" w:sz="4"/>
-          <w:right w:val="single" w:color="auto" w:sz="4"/>
-          <w:insideH w:val="single" w:color="auto" w:sz="4"/>
-          <w:insideV w:val="single" w:color="auto" w:sz="4"/>
-        </w:tblBorders>
-      </w:tblPr>
-      <w:tblGrid>
-        <w:gridCol w:w="9638"/>
-      </w:tblGrid>
-      <w:tr>
-        <w:trPr>
-          <w:trHeight w:val="3600" w:hRule="atLeast"/>
-        </w:trPr>
-        <w:tc>
-          <w:tcPr>
-            <w:tcW w:type="dxa" w:w="9638"/>
-            <w:tcBorders>
-              <w:top w:val="dashed" w:color="7FA996" w:sz="8"/>
-              <w:left w:val="dashed" w:color="7FA996" w:sz="8"/>
-              <w:bottom w:val="dashed" w:color="7FA996" w:sz="8"/>
-              <w:right w:val="dashed" w:color="7FA996" w:sz="8"/>
-            </w:tcBorders>
-            <w:shd w:fill="F7FAF8" w:color="auto" w:val="clear"/>
-            <w:tcMar>
-              <w:top w:type="dxa" w:w="200"/>
-              <w:left w:type="dxa" w:w="200"/>
-              <w:bottom w:type="dxa" w:w="200"/>
-              <w:right w:type="dxa" w:w="200"/>
-            </w:tcMar>
-            <w:vAlign w:val="center"/>
-          </w:tcPr>
-          <w:p>
-            <w:pPr>
-              <w:spacing w:after="60"/>
-              <w:jc w:val="center"/>
-            </w:pPr>
-            <w:r>
-              <w:rPr>
-                <w:rFonts w:ascii="Calibri" w:cs="Calibri" w:eastAsia="Calibri" w:hAnsi="Calibri"/>
-                <w:b/>
-                <w:bCs/>
-                <w:color w:val="7FA996"/>
-                <w:sz w:val="22"/>
-                <w:szCs w:val="22"/>
-              </w:rPr>
-              <w:t xml:space="preserve">[ colar o print aqui ]</w:t>
-            </w:r>
-          </w:p>
-          <w:p>
-            <w:pPr>
-              <w:spacing w:after="0"/>
-              <w:jc w:val="center"/>
-            </w:pPr>
-            <w:r>
-              <w:rPr>
-                <w:rFonts w:ascii="Calibri" w:cs="Calibri" w:eastAsia="Calibri" w:hAnsi="Calibri"/>
-                <w:i/>
-                <w:iCs/>
-                <w:color w:val="6B7C74"/>
-                <w:sz w:val="19"/>
-                <w:szCs w:val="19"/>
-              </w:rPr>
-              <w:t xml:space="preserve">Navegador em http://&lt;IP&gt;:8080/health mostrando "environment":"Production"</w:t>
-            </w:r>
-          </w:p>
-        </w:tc>
-      </w:tr>
-    </w:tbl>
+    <w:p>
+      <w:pPr>
+        <w:keepNext/>
+        <w:spacing w:after="60"/>
+        <w:jc w:val="center"/>
+      </w:pPr>
+      <w:r>
+        <w:drawing>
+          <wp:inline distT="0" distB="0" distL="0" distR="0">
+            <wp:extent cx="6096000" cy="714375"/>
+            <wp:effectExtent t="0" r="0" b="0" l="0"/>
+            <wp:docPr id="1" name="" descr="" title=""/>
+            <wp:cNvGraphicFramePr>
+              <a:graphicFrameLocks xmlns:a="http://schemas.openxmlformats.org/drawingml/2006/main" noChangeAspect="1"/>
+            </wp:cNvGraphicFramePr>
+            <a:graphic xmlns:a="http://schemas.openxmlformats.org/drawingml/2006/main">
+              <a:graphicData uri="http://schemas.openxmlformats.org/drawingml/2006/picture">
+                <pic:pic xmlns:pic="http://schemas.openxmlformats.org/drawingml/2006/picture">
+                  <pic:nvPicPr>
+                    <pic:cNvPr id="0" name="" descr=""/>
+                    <pic:cNvPicPr>
+                      <a:picLocks noChangeAspect="1" noChangeArrowheads="1"/>
+                    </pic:cNvPicPr>
+                  </pic:nvPicPr>
+                  <pic:blipFill>
+                    <a:blip r:embed="rId15" cstate="none"/>
+                    <a:srcRect/>
+                    <a:stretch>
+                      <a:fillRect/>
+                    </a:stretch>
+                  </pic:blipFill>
+                  <pic:spPr bwMode="auto">
+                    <a:xfrm>
+                      <a:off x="0" y="0"/>
+                      <a:ext cx="6096000" cy="714375"/>
+                    </a:xfrm>
+                    <a:prstGeom prst="rect">
+                      <a:avLst/>
+                    </a:prstGeom>
+                  </pic:spPr>
+                </pic:pic>
+              </a:graphicData>
+            </a:graphic>
+          </wp:inline>
+        </w:drawing>
+      </w:r>
+    </w:p>
+    <w:p>
+      <w:pPr>
+        <w:spacing w:after="160"/>
+      </w:pPr>
+      <w:r>
+        <w:rPr>
+          <w:rFonts w:ascii="Calibri" w:cs="Calibri" w:eastAsia="Calibri" w:hAnsi="Calibri"/>
+          <w:i/>
+          <w:iCs/>
+          <w:color w:val="6B7C74"/>
+          <w:sz w:val="19"/>
+          <w:szCs w:val="19"/>
+        </w:rPr>
+        <w:t xml:space="preserve">http://68.211.144.197:8080/health respondendo com environment Production e banco Up.</w:t>
+      </w:r>
+    </w:p>
     <w:p>
       <w:pPr>
         <w:keepNext/>
@@ -4268,80 +4642,69 @@
         <w:t xml:space="preserve">Figura 9. Swagger da produção</w:t>
       </w:r>
     </w:p>
-    <w:tbl>
-      <w:tblPr>
-        <w:tblW w:type="dxa" w:w="9638"/>
-        <w:tblBorders>
-          <w:top w:val="single" w:color="auto" w:sz="4"/>
-          <w:left w:val="single" w:color="auto" w:sz="4"/>
-          <w:bottom w:val="single" w:color="auto" w:sz="4"/>
-          <w:right w:val="single" w:color="auto" w:sz="4"/>
-          <w:insideH w:val="single" w:color="auto" w:sz="4"/>
-          <w:insideV w:val="single" w:color="auto" w:sz="4"/>
-        </w:tblBorders>
-      </w:tblPr>
-      <w:tblGrid>
-        <w:gridCol w:w="9638"/>
-      </w:tblGrid>
-      <w:tr>
-        <w:trPr>
-          <w:trHeight w:val="3600" w:hRule="atLeast"/>
-        </w:trPr>
-        <w:tc>
-          <w:tcPr>
-            <w:tcW w:type="dxa" w:w="9638"/>
-            <w:tcBorders>
-              <w:top w:val="dashed" w:color="7FA996" w:sz="8"/>
-              <w:left w:val="dashed" w:color="7FA996" w:sz="8"/>
-              <w:bottom w:val="dashed" w:color="7FA996" w:sz="8"/>
-              <w:right w:val="dashed" w:color="7FA996" w:sz="8"/>
-            </w:tcBorders>
-            <w:shd w:fill="F7FAF8" w:color="auto" w:val="clear"/>
-            <w:tcMar>
-              <w:top w:type="dxa" w:w="200"/>
-              <w:left w:type="dxa" w:w="200"/>
-              <w:bottom w:type="dxa" w:w="200"/>
-              <w:right w:type="dxa" w:w="200"/>
-            </w:tcMar>
-            <w:vAlign w:val="center"/>
-          </w:tcPr>
-          <w:p>
-            <w:pPr>
-              <w:spacing w:after="60"/>
-              <w:jc w:val="center"/>
-            </w:pPr>
-            <w:r>
-              <w:rPr>
-                <w:rFonts w:ascii="Calibri" w:cs="Calibri" w:eastAsia="Calibri" w:hAnsi="Calibri"/>
-                <w:b/>
-                <w:bCs/>
-                <w:color w:val="7FA996"/>
-                <w:sz w:val="22"/>
-                <w:szCs w:val="22"/>
-              </w:rPr>
-              <w:t xml:space="preserve">[ colar o print aqui ]</w:t>
-            </w:r>
-          </w:p>
-          <w:p>
-            <w:pPr>
-              <w:spacing w:after="0"/>
-              <w:jc w:val="center"/>
-            </w:pPr>
-            <w:r>
-              <w:rPr>
-                <w:rFonts w:ascii="Calibri" w:cs="Calibri" w:eastAsia="Calibri" w:hAnsi="Calibri"/>
-                <w:i/>
-                <w:iCs/>
-                <w:color w:val="6B7C74"/>
-                <w:sz w:val="19"/>
-                <w:szCs w:val="19"/>
-              </w:rPr>
-              <w:t xml:space="preserve">Login e uma chamada autenticada (ex.: GET /api/empresas com 200)</w:t>
-            </w:r>
-          </w:p>
-        </w:tc>
-      </w:tr>
-    </w:tbl>
+    <w:p>
+      <w:pPr>
+        <w:keepNext/>
+        <w:spacing w:after="60"/>
+        <w:jc w:val="center"/>
+      </w:pPr>
+      <w:r>
+        <w:drawing>
+          <wp:inline distT="0" distB="0" distL="0" distR="0">
+            <wp:extent cx="6096000" cy="3924300"/>
+            <wp:effectExtent t="0" r="0" b="0" l="0"/>
+            <wp:docPr id="1" name="" descr="" title=""/>
+            <wp:cNvGraphicFramePr>
+              <a:graphicFrameLocks xmlns:a="http://schemas.openxmlformats.org/drawingml/2006/main" noChangeAspect="1"/>
+            </wp:cNvGraphicFramePr>
+            <a:graphic xmlns:a="http://schemas.openxmlformats.org/drawingml/2006/main">
+              <a:graphicData uri="http://schemas.openxmlformats.org/drawingml/2006/picture">
+                <pic:pic xmlns:pic="http://schemas.openxmlformats.org/drawingml/2006/picture">
+                  <pic:nvPicPr>
+                    <pic:cNvPr id="0" name="" descr=""/>
+                    <pic:cNvPicPr>
+                      <a:picLocks noChangeAspect="1" noChangeArrowheads="1"/>
+                    </pic:cNvPicPr>
+                  </pic:nvPicPr>
+                  <pic:blipFill>
+                    <a:blip r:embed="rId16" cstate="none"/>
+                    <a:srcRect/>
+                    <a:stretch>
+                      <a:fillRect/>
+                    </a:stretch>
+                  </pic:blipFill>
+                  <pic:spPr bwMode="auto">
+                    <a:xfrm>
+                      <a:off x="0" y="0"/>
+                      <a:ext cx="6096000" cy="3924300"/>
+                    </a:xfrm>
+                    <a:prstGeom prst="rect">
+                      <a:avLst/>
+                    </a:prstGeom>
+                  </pic:spPr>
+                </pic:pic>
+              </a:graphicData>
+            </a:graphic>
+          </wp:inline>
+        </w:drawing>
+      </w:r>
+    </w:p>
+    <w:p>
+      <w:pPr>
+        <w:spacing w:after="160"/>
+      </w:pPr>
+      <w:r>
+        <w:rPr>
+          <w:rFonts w:ascii="Calibri" w:cs="Calibri" w:eastAsia="Calibri" w:hAnsi="Calibri"/>
+          <w:i/>
+          <w:iCs/>
+          <w:color w:val="6B7C74"/>
+          <w:sz w:val="19"/>
+          <w:szCs w:val="19"/>
+        </w:rPr>
+        <w:t xml:space="preserve">Swagger de produção: GET /api/empresas com token JWT retornando HTTP 200.</w:t>
+      </w:r>
+    </w:p>
     <w:p>
       <w:pPr>
         <w:keepNext/>
@@ -4359,80 +4722,69 @@
         <w:t xml:space="preserve">Figura 10. Containers na VM</w:t>
       </w:r>
     </w:p>
-    <w:tbl>
-      <w:tblPr>
-        <w:tblW w:type="dxa" w:w="9638"/>
-        <w:tblBorders>
-          <w:top w:val="single" w:color="auto" w:sz="4"/>
-          <w:left w:val="single" w:color="auto" w:sz="4"/>
-          <w:bottom w:val="single" w:color="auto" w:sz="4"/>
-          <w:right w:val="single" w:color="auto" w:sz="4"/>
-          <w:insideH w:val="single" w:color="auto" w:sz="4"/>
-          <w:insideV w:val="single" w:color="auto" w:sz="4"/>
-        </w:tblBorders>
-      </w:tblPr>
-      <w:tblGrid>
-        <w:gridCol w:w="9638"/>
-      </w:tblGrid>
-      <w:tr>
-        <w:trPr>
-          <w:trHeight w:val="3600" w:hRule="atLeast"/>
-        </w:trPr>
-        <w:tc>
-          <w:tcPr>
-            <w:tcW w:type="dxa" w:w="9638"/>
-            <w:tcBorders>
-              <w:top w:val="dashed" w:color="7FA996" w:sz="8"/>
-              <w:left w:val="dashed" w:color="7FA996" w:sz="8"/>
-              <w:bottom w:val="dashed" w:color="7FA996" w:sz="8"/>
-              <w:right w:val="dashed" w:color="7FA996" w:sz="8"/>
-            </w:tcBorders>
-            <w:shd w:fill="F7FAF8" w:color="auto" w:val="clear"/>
-            <w:tcMar>
-              <w:top w:type="dxa" w:w="200"/>
-              <w:left w:type="dxa" w:w="200"/>
-              <w:bottom w:type="dxa" w:w="200"/>
-              <w:right w:type="dxa" w:w="200"/>
-            </w:tcMar>
-            <w:vAlign w:val="center"/>
-          </w:tcPr>
-          <w:p>
-            <w:pPr>
-              <w:spacing w:after="60"/>
-              <w:jc w:val="center"/>
-            </w:pPr>
-            <w:r>
-              <w:rPr>
-                <w:rFonts w:ascii="Calibri" w:cs="Calibri" w:eastAsia="Calibri" w:hAnsi="Calibri"/>
-                <w:b/>
-                <w:bCs/>
-                <w:color w:val="7FA996"/>
-                <w:sz w:val="22"/>
-                <w:szCs w:val="22"/>
-              </w:rPr>
-              <w:t xml:space="preserve">[ colar o print aqui ]</w:t>
-            </w:r>
-          </w:p>
-          <w:p>
-            <w:pPr>
-              <w:spacing w:after="0"/>
-              <w:jc w:val="center"/>
-            </w:pPr>
-            <w:r>
-              <w:rPr>
-                <w:rFonts w:ascii="Calibri" w:cs="Calibri" w:eastAsia="Calibri" w:hAnsi="Calibri"/>
-                <w:i/>
-                <w:iCs/>
-                <w:color w:val="6B7C74"/>
-                <w:sz w:val="19"/>
-                <w:szCs w:val="19"/>
-              </w:rPr>
-              <w:t xml:space="preserve">Terminal SSH com docker ps mostrando elos-staging e elos-production</w:t>
-            </w:r>
-          </w:p>
-        </w:tc>
-      </w:tr>
-    </w:tbl>
+    <w:p>
+      <w:pPr>
+        <w:keepNext/>
+        <w:spacing w:after="60"/>
+        <w:jc w:val="center"/>
+      </w:pPr>
+      <w:r>
+        <w:drawing>
+          <wp:inline distT="0" distB="0" distL="0" distR="0">
+            <wp:extent cx="6096000" cy="485775"/>
+            <wp:effectExtent t="0" r="0" b="0" l="0"/>
+            <wp:docPr id="1" name="" descr="" title=""/>
+            <wp:cNvGraphicFramePr>
+              <a:graphicFrameLocks xmlns:a="http://schemas.openxmlformats.org/drawingml/2006/main" noChangeAspect="1"/>
+            </wp:cNvGraphicFramePr>
+            <a:graphic xmlns:a="http://schemas.openxmlformats.org/drawingml/2006/main">
+              <a:graphicData uri="http://schemas.openxmlformats.org/drawingml/2006/picture">
+                <pic:pic xmlns:pic="http://schemas.openxmlformats.org/drawingml/2006/picture">
+                  <pic:nvPicPr>
+                    <pic:cNvPr id="0" name="" descr=""/>
+                    <pic:cNvPicPr>
+                      <a:picLocks noChangeAspect="1" noChangeArrowheads="1"/>
+                    </pic:cNvPicPr>
+                  </pic:nvPicPr>
+                  <pic:blipFill>
+                    <a:blip r:embed="rId17" cstate="none"/>
+                    <a:srcRect/>
+                    <a:stretch>
+                      <a:fillRect/>
+                    </a:stretch>
+                  </pic:blipFill>
+                  <pic:spPr bwMode="auto">
+                    <a:xfrm>
+                      <a:off x="0" y="0"/>
+                      <a:ext cx="6096000" cy="485775"/>
+                    </a:xfrm>
+                    <a:prstGeom prst="rect">
+                      <a:avLst/>
+                    </a:prstGeom>
+                  </pic:spPr>
+                </pic:pic>
+              </a:graphicData>
+            </a:graphic>
+          </wp:inline>
+        </w:drawing>
+      </w:r>
+    </w:p>
+    <w:p>
+      <w:pPr>
+        <w:spacing w:after="160"/>
+      </w:pPr>
+      <w:r>
+        <w:rPr>
+          <w:rFonts w:ascii="Calibri" w:cs="Calibri" w:eastAsia="Calibri" w:hAnsi="Calibri"/>
+          <w:i/>
+          <w:iCs/>
+          <w:color w:val="6B7C74"/>
+          <w:sz w:val="19"/>
+          <w:szCs w:val="19"/>
+        </w:rPr>
+        <w:t xml:space="preserve">docker ps na VM: API e Oracle de cada ambiente rodando e healthy.</w:t>
+      </w:r>
+    </w:p>
     <w:p>
       <w:pPr>
         <w:keepNext/>
@@ -4450,83 +4802,67 @@
         <w:t xml:space="preserve">Figura 11. Environments no GitHub</w:t>
       </w:r>
     </w:p>
-    <w:tbl>
-      <w:tblPr>
-        <w:tblW w:type="dxa" w:w="9638"/>
-        <w:tblBorders>
-          <w:top w:val="single" w:color="auto" w:sz="4"/>
-          <w:left w:val="single" w:color="auto" w:sz="4"/>
-          <w:bottom w:val="single" w:color="auto" w:sz="4"/>
-          <w:right w:val="single" w:color="auto" w:sz="4"/>
-          <w:insideH w:val="single" w:color="auto" w:sz="4"/>
-          <w:insideV w:val="single" w:color="auto" w:sz="4"/>
-        </w:tblBorders>
-      </w:tblPr>
-      <w:tblGrid>
-        <w:gridCol w:w="9638"/>
-      </w:tblGrid>
-      <w:tr>
-        <w:trPr>
-          <w:trHeight w:val="3600" w:hRule="atLeast"/>
-        </w:trPr>
-        <w:tc>
-          <w:tcPr>
-            <w:tcW w:type="dxa" w:w="9638"/>
-            <w:tcBorders>
-              <w:top w:val="dashed" w:color="7FA996" w:sz="8"/>
-              <w:left w:val="dashed" w:color="7FA996" w:sz="8"/>
-              <w:bottom w:val="dashed" w:color="7FA996" w:sz="8"/>
-              <w:right w:val="dashed" w:color="7FA996" w:sz="8"/>
-            </w:tcBorders>
-            <w:shd w:fill="F7FAF8" w:color="auto" w:val="clear"/>
-            <w:tcMar>
-              <w:top w:type="dxa" w:w="200"/>
-              <w:left w:type="dxa" w:w="200"/>
-              <w:bottom w:type="dxa" w:w="200"/>
-              <w:right w:type="dxa" w:w="200"/>
-            </w:tcMar>
-            <w:vAlign w:val="center"/>
-          </w:tcPr>
-          <w:p>
-            <w:pPr>
-              <w:spacing w:after="60"/>
-              <w:jc w:val="center"/>
-            </w:pPr>
-            <w:r>
-              <w:rPr>
-                <w:rFonts w:ascii="Calibri" w:cs="Calibri" w:eastAsia="Calibri" w:hAnsi="Calibri"/>
-                <w:b/>
-                <w:bCs/>
-                <w:color w:val="7FA996"/>
-                <w:sz w:val="22"/>
-                <w:szCs w:val="22"/>
-              </w:rPr>
-              <w:t xml:space="preserve">[ colar o print aqui ]</w:t>
-            </w:r>
-          </w:p>
-          <w:p>
-            <w:pPr>
-              <w:spacing w:after="0"/>
-              <w:jc w:val="center"/>
-            </w:pPr>
-            <w:r>
-              <w:rPr>
-                <w:rFonts w:ascii="Calibri" w:cs="Calibri" w:eastAsia="Calibri" w:hAnsi="Calibri"/>
-                <w:i/>
-                <w:iCs/>
-                <w:color w:val="6B7C74"/>
-                <w:sz w:val="19"/>
-                <w:szCs w:val="19"/>
-              </w:rPr>
-              <w:t xml:space="preserve">Página de Deployments/Environments com staging e production ativos</w:t>
-            </w:r>
-          </w:p>
-        </w:tc>
-      </w:tr>
-    </w:tbl>
-    <w:p>
-      <w:r>
-        <w:br w:type="page"/>
+    <w:p>
+      <w:pPr>
+        <w:keepNext/>
+        <w:spacing w:after="60"/>
+        <w:jc w:val="center"/>
+      </w:pPr>
+      <w:r>
+        <w:drawing>
+          <wp:inline distT="0" distB="0" distL="0" distR="0">
+            <wp:extent cx="6096000" cy="2390775"/>
+            <wp:effectExtent t="0" r="0" b="0" l="0"/>
+            <wp:docPr id="1" name="" descr="" title=""/>
+            <wp:cNvGraphicFramePr>
+              <a:graphicFrameLocks xmlns:a="http://schemas.openxmlformats.org/drawingml/2006/main" noChangeAspect="1"/>
+            </wp:cNvGraphicFramePr>
+            <a:graphic xmlns:a="http://schemas.openxmlformats.org/drawingml/2006/main">
+              <a:graphicData uri="http://schemas.openxmlformats.org/drawingml/2006/picture">
+                <pic:pic xmlns:pic="http://schemas.openxmlformats.org/drawingml/2006/picture">
+                  <pic:nvPicPr>
+                    <pic:cNvPr id="0" name="" descr=""/>
+                    <pic:cNvPicPr>
+                      <a:picLocks noChangeAspect="1" noChangeArrowheads="1"/>
+                    </pic:cNvPicPr>
+                  </pic:nvPicPr>
+                  <pic:blipFill>
+                    <a:blip r:embed="rId18" cstate="none"/>
+                    <a:srcRect/>
+                    <a:stretch>
+                      <a:fillRect/>
+                    </a:stretch>
+                  </pic:blipFill>
+                  <pic:spPr bwMode="auto">
+                    <a:xfrm>
+                      <a:off x="0" y="0"/>
+                      <a:ext cx="6096000" cy="2390775"/>
+                    </a:xfrm>
+                    <a:prstGeom prst="rect">
+                      <a:avLst/>
+                    </a:prstGeom>
+                  </pic:spPr>
+                </pic:pic>
+              </a:graphicData>
+            </a:graphic>
+          </wp:inline>
+        </w:drawing>
+      </w:r>
+    </w:p>
+    <w:p>
+      <w:pPr>
+        <w:spacing w:after="160"/>
+      </w:pPr>
+      <w:r>
+        <w:rPr>
+          <w:rFonts w:ascii="Calibri" w:cs="Calibri" w:eastAsia="Calibri" w:hAnsi="Calibri"/>
+          <w:i/>
+          <w:iCs/>
+          <w:color w:val="6B7C74"/>
+          <w:sz w:val="19"/>
+          <w:szCs w:val="19"/>
+        </w:rPr>
+        <w:t xml:space="preserve">Deployments do GitHub com os ambientes staging e production.</w:t>
       </w:r>
     </w:p>
     <w:p>
@@ -4623,6 +4959,148 @@
                 <w:szCs w:val="20"/>
               </w:rPr>
               <w:t xml:space="preserve">Como foi resolvido</w:t>
+            </w:r>
+          </w:p>
+        </w:tc>
+      </w:tr>
+      <w:tr>
+        <w:trPr>
+          <w:tblHeader w:val="false"/>
+        </w:trPr>
+        <w:tc>
+          <w:tcPr>
+            <w:tcW w:type="dxa" w:w="2600"/>
+            <w:tcBorders>
+              <w:top w:val="single" w:color="BFC9C4" w:sz="4"/>
+              <w:left w:val="single" w:color="BFC9C4" w:sz="4"/>
+              <w:bottom w:val="single" w:color="BFC9C4" w:sz="4"/>
+              <w:right w:val="single" w:color="BFC9C4" w:sz="4"/>
+            </w:tcBorders>
+            <w:tcMar>
+              <w:top w:type="dxa" w:w="80"/>
+              <w:left w:type="dxa" w:w="110"/>
+              <w:bottom w:type="dxa" w:w="80"/>
+              <w:right w:type="dxa" w:w="110"/>
+            </w:tcMar>
+          </w:tcPr>
+          <w:p>
+            <w:pPr>
+              <w:spacing w:after="0" w:line="270"/>
+            </w:pPr>
+            <w:r>
+              <w:rPr>
+                <w:rFonts w:ascii="Calibri" w:cs="Calibri" w:eastAsia="Calibri" w:hAnsi="Calibri"/>
+                <w:b w:val="false"/>
+                <w:bCs w:val="false"/>
+                <w:color w:val="222222"/>
+                <w:sz w:val="20"/>
+                <w:szCs w:val="20"/>
+              </w:rPr>
+              <w:t xml:space="preserve">Regiões bloqueadas na assinatura Azure for Students</w:t>
+            </w:r>
+          </w:p>
+        </w:tc>
+        <w:tc>
+          <w:tcPr>
+            <w:tcW w:type="dxa" w:w="7038"/>
+            <w:tcBorders>
+              <w:top w:val="single" w:color="BFC9C4" w:sz="4"/>
+              <w:left w:val="single" w:color="BFC9C4" w:sz="4"/>
+              <w:bottom w:val="single" w:color="BFC9C4" w:sz="4"/>
+              <w:right w:val="single" w:color="BFC9C4" w:sz="4"/>
+            </w:tcBorders>
+            <w:tcMar>
+              <w:top w:type="dxa" w:w="80"/>
+              <w:left w:type="dxa" w:w="110"/>
+              <w:bottom w:type="dxa" w:w="80"/>
+              <w:right w:type="dxa" w:w="110"/>
+            </w:tcMar>
+          </w:tcPr>
+          <w:p>
+            <w:pPr>
+              <w:spacing w:after="0" w:line="270"/>
+            </w:pPr>
+            <w:r>
+              <w:rPr>
+                <w:rFonts w:ascii="Calibri" w:cs="Calibri" w:eastAsia="Calibri" w:hAnsi="Calibri"/>
+                <w:b w:val="false"/>
+                <w:bCs w:val="false"/>
+                <w:color w:val="222222"/>
+                <w:sz w:val="20"/>
+                <w:szCs w:val="20"/>
+              </w:rPr>
+              <w:t xml:space="preserve">Na primeira tentativa a criação da VM em East US falhou com RequestDisallowedByAzure. A assinatura da faculdade tem uma policy que só libera algumas regiões. Consultei a policy com az policy assignment list e a lista permitida era Belgium Central, Italy North, Chile Central, Mexico Central e South Africa North. Usei Chile Central, a mais próxima do Brasil.</w:t>
+            </w:r>
+          </w:p>
+        </w:tc>
+      </w:tr>
+      <w:tr>
+        <w:trPr>
+          <w:tblHeader w:val="false"/>
+        </w:trPr>
+        <w:tc>
+          <w:tcPr>
+            <w:tcW w:type="dxa" w:w="2600"/>
+            <w:tcBorders>
+              <w:top w:val="single" w:color="BFC9C4" w:sz="4"/>
+              <w:left w:val="single" w:color="BFC9C4" w:sz="4"/>
+              <w:bottom w:val="single" w:color="BFC9C4" w:sz="4"/>
+              <w:right w:val="single" w:color="BFC9C4" w:sz="4"/>
+            </w:tcBorders>
+            <w:tcMar>
+              <w:top w:type="dxa" w:w="80"/>
+              <w:left w:type="dxa" w:w="110"/>
+              <w:bottom w:type="dxa" w:w="80"/>
+              <w:right w:type="dxa" w:w="110"/>
+            </w:tcMar>
+          </w:tcPr>
+          <w:p>
+            <w:pPr>
+              <w:spacing w:after="0" w:line="270"/>
+            </w:pPr>
+            <w:r>
+              <w:rPr>
+                <w:rFonts w:ascii="Calibri" w:cs="Calibri" w:eastAsia="Calibri" w:hAnsi="Calibri"/>
+                <w:b w:val="false"/>
+                <w:bCs w:val="false"/>
+                <w:color w:val="222222"/>
+                <w:sz w:val="20"/>
+                <w:szCs w:val="20"/>
+              </w:rPr>
+              <w:t xml:space="preserve">Tamanho de VM sem capacidade</w:t>
+            </w:r>
+          </w:p>
+        </w:tc>
+        <w:tc>
+          <w:tcPr>
+            <w:tcW w:type="dxa" w:w="7038"/>
+            <w:tcBorders>
+              <w:top w:val="single" w:color="BFC9C4" w:sz="4"/>
+              <w:left w:val="single" w:color="BFC9C4" w:sz="4"/>
+              <w:bottom w:val="single" w:color="BFC9C4" w:sz="4"/>
+              <w:right w:val="single" w:color="BFC9C4" w:sz="4"/>
+            </w:tcBorders>
+            <w:tcMar>
+              <w:top w:type="dxa" w:w="80"/>
+              <w:left w:type="dxa" w:w="110"/>
+              <w:bottom w:type="dxa" w:w="80"/>
+              <w:right w:type="dxa" w:w="110"/>
+            </w:tcMar>
+          </w:tcPr>
+          <w:p>
+            <w:pPr>
+              <w:spacing w:after="0" w:line="270"/>
+            </w:pPr>
+            <w:r>
+              <w:rPr>
+                <w:rFonts w:ascii="Calibri" w:cs="Calibri" w:eastAsia="Calibri" w:hAnsi="Calibri"/>
+                <w:b w:val="false"/>
+                <w:bCs w:val="false"/>
+                <w:color w:val="222222"/>
+                <w:sz w:val="20"/>
+                <w:szCs w:val="20"/>
+              </w:rPr>
+              <w:t xml:space="preserve">O tamanho planejado (Standard_B2ms) retornou SkuNotAvailable no Chile e no México. Fiz um loop no Cloud Shell testando outros tamanhos com memória suficiente para dois Oracle e o Standard_B2s_v2 (2 vCPU, 8 GB) funcionou de primeira no Chile Central.</w:t>
             </w:r>
           </w:p>
         </w:tc>

</xml_diff>